<commit_message>
Rebuild the conclusion on the pattern the sample reports use
Chapter 6 was two sections, Conclusion and Future Work, and 2 pages. It
now follows the structure all five sample reports share: Summary of
Findings, Contributions to the Field, Limitations, and Recommendations
for Future Work, with the recommendations grouped under their own
headings and closing on final remarks.

The summary walks the two parts of the work with their numbers, and
states the four findings that limit the claim alongside the ones that
support it. The contributions are enumerated, and two of the six are
negative results - that a more accurate detector bought nothing, and
that retrieval made rule following worse - which are as useful to
someone repeating this work as the positive ones.

Chapter 6 is now 3 pages, the same as the samples.

Co-Authored-By: Claude Opus 5 (1M context) <noreply@anthropic.com>
</commit_message>
<xml_diff>
--- a/final writing/Chapter_6_Conclusion.docx
+++ b/final writing/Chapter_6_Conclusion.docx
@@ -15,7 +15,7 @@
         <w:pStyle w:val="Heading1"/>
       </w:pPr>
       <w:r>
-        <w:t>6.1 Conclusion</w:t>
+        <w:t>6.1 Summary of Findings</w:t>
       </w:r>
     </w:p>
     <w:p>
@@ -23,7 +23,7 @@
         <w:spacing w:after="120"/>
       </w:pPr>
       <w:r>
-        <w:t>This thesis set out to test whether separating emotion detection from response generation is worth doing, at a size that fits an ordinary computer. The answer, from 4,200 scored replies across fourteen system configurations, is a qualified yes.</w:t>
+        <w:t>The objective of this research was to build an empathetic response system that separates emotion detection from response generation, to run the whole of it inside the 8 GB of an ordinary consumer graphics card, and to establish by measurement whether that separation is worth its extra component. The answer, from 4,200 scored replies across fourteen configurations, is a qualified yes, and the qualification is reported as plainly as the support.</w:t>
       </w:r>
     </w:p>
     <w:p>
@@ -31,7 +31,43 @@
         <w:spacing w:after="120"/>
       </w:pPr>
       <w:r>
-        <w:t>Three findings support the design. First, at a comparable scale the decoupled system is significantly more empathetic than a single model that does both jobs: against the 1.5-billion-parameter single model it scores higher on the empathy classifier, higher on both AI judges and 11.0 points higher on emotion fidelity. Second, the advantage comes from the design and not from the size of the generator; when the same 3.8-billion-parameter generator is prompted alone, its empathy-classifier score and emotion fidelity fall to the level of a model less than half its size, and adding the detector with emotion-specific guidance raises them again. Third, the system does this within the resource budget it was designed for: 3.40 GB of GPU memory, 38% less than a single model with 1.9 times its parameters, with no significant difference in response time or in judge-rated quality.</w:t>
+        <w:t xml:space="preserve">The work divides into two parts. The first built the detector. Five encoders and decoders were trained under identical conditions, and RoBERTa-base was selected: 50.3% top-1 accuracy over the 32 emotions of EmpatheticDialogues and 84.3% within its top five, above every jointly trained model published on this corpus. Two findings matter more than that number. The detector's mistakes are almost all near neighbours, </w:t>
+      </w:r>
+      <w:r>
+        <w:rPr>
+          <w:i/>
+        </w:rPr>
+        <w:t>afraid</w:t>
+      </w:r>
+      <w:r>
+        <w:t xml:space="preserve"> read as </w:t>
+      </w:r>
+      <w:r>
+        <w:rPr>
+          <w:i/>
+        </w:rPr>
+        <w:t>terrified</w:t>
+      </w:r>
+      <w:r>
+        <w:t xml:space="preserve"> or </w:t>
+      </w:r>
+      <w:r>
+        <w:rPr>
+          <w:i/>
+        </w:rPr>
+        <w:t>sad</w:t>
+      </w:r>
+      <w:r>
+        <w:t xml:space="preserve"> as </w:t>
+      </w:r>
+      <w:r>
+        <w:rPr>
+          <w:i/>
+        </w:rPr>
+        <w:t>devastated</w:t>
+      </w:r>
+      <w:r>
+        <w:t>, so a reply built on a wrong label is rarely built on the wrong kind of feeling; and what it is trained on matters more than which network is chosen, since training on the corpus's situation descriptions while deploying on the user's own message cost about nine points. Passing three candidate emotions rather than one follows from both.</w:t>
       </w:r>
     </w:p>
     <w:p>
@@ -39,7 +75,7 @@
         <w:spacing w:after="120"/>
       </w:pPr>
       <w:r>
-        <w:t>Two findings limit the claim, and are reported as plainly as the positive ones. The larger single model remains better on rule adherence and on the empathy classifier, so a deployment with the hardware to run it and no need for an auditable emotional decision should use it. And at an equal generator the AI judges do not separate the two configurations: the case for the decoupled design rests on emotion fidelity, the empathy classifier, less repetition and the visible emotional decision, not on the judges' preference.</w:t>
+        <w:t>The second part built and tested the pipeline. Three generators were compared with the detector and the prompt held fixed, and five ways of connecting the two models were measured against each other. The selected design, in which Phi-4-mini first chooses among the detector's three candidates and then writes under per-emotion guidance, places second of the eight systems on the combined empathy panel, at +0.59 against +1.11 for a single model almost twice its size. Two comparisons carry the argument. The same generator prompted alone scores +0.53, so the gain comes from the design and not from the size of the generator; and the system expresses the speaker's true emotion in 36.7% of replies, the highest of the twelve systems measured and 11.0 points above a single model of comparable scale. It does this in 3.40 GB of peak memory with 3.96 billion parameters and 4.17 seconds per reply: 38% less memory than a single model with 1.9 times the parameters, at no significant cost in response time.</w:t>
       </w:r>
     </w:p>
     <w:p>
@@ -47,7 +83,7 @@
         <w:spacing w:after="120"/>
       </w:pPr>
       <w:r>
-        <w:t>The contribution of this work is therefore not a new record on a benchmark. It is a measured account of what a decoupled design buys and what it costs, at a scale where the choice actually matters, together with a working multi-turn agent that shows the emotional decision behind every reply.</w:t>
+        <w:t>Four findings limit the claim. The largest single model remains ahead on the empathy panel, so a deployment with the hardware to run a 7-billion-parameter model and no need for an auditable emotional decision should use one. Our system follows its own three response rules in 60.0% of replies against 73.7% for the same generator alone, because the rules share prompt space with the emotional guidance. The two model judges on their own do not separate the two configurations, so the case rests on the empathy classifier, emotional fidelity, lower repetition and the visible decision rather than on judge preference. And replacing the detector with a more accurate one, three points better on the same test, changed no measure of reply quality at all, which means the detector was not the limiting component.</w:t>
       </w:r>
     </w:p>
     <w:p>
@@ -55,7 +91,7 @@
         <w:pStyle w:val="Heading1"/>
       </w:pPr>
       <w:r>
-        <w:t>6.2 Future Work</w:t>
+        <w:t>6.2 Contributions to the Field</w:t>
       </w:r>
     </w:p>
     <w:p>
@@ -63,7 +99,71 @@
         <w:spacing w:after="120"/>
       </w:pPr>
       <w:r>
-        <w:t>Four directions follow directly from the results.</w:t>
+        <w:t>This research makes six contributions. First, and most importantly, it provides a measured account of what a decoupled design buys and what it costs at a scale where the choice actually matters. Pairing a small emotion model with a large language model has been proposed before, but not evaluated under a hardware ceiling against single models of both comparable and larger size, which is the comparison someone deciding how to build such a system actually needs.</w:t>
+      </w:r>
+    </w:p>
+    <w:p>
+      <w:pPr>
+        <w:spacing w:after="120"/>
+      </w:pPr>
+      <w:r>
+        <w:t>Second, it records negative results that should save other researchers effort. Substituting a detector with three points more accuracy improved no measure of the reply, which indicates that the detector's value is in the structure it supplies rather than in the precision of its label, and that further accuracy is not where the remaining gains lie. In the same spirit, retrieval augmentation, added on the reasonable expectation that related passages would help, reduced rule adherence from 63.7% to 43.7% and improved nothing.</w:t>
+      </w:r>
+    </w:p>
+    <w:p>
+      <w:pPr>
+        <w:spacing w:after="120"/>
+      </w:pPr>
+      <w:r>
+        <w:t>Third, it makes the emotional decision auditable. Every reply carries the three candidate emotions with their confidence, the emotion chosen from them, and the words that drove the detection. An end-to-end model can produce a comparable reply but cannot report what it answered, which leaves nowhere to attach a safeguard and nothing to inspect when a reply is wrong: in a sensitive domain, a difference in kind rather than degree.</w:t>
+      </w:r>
+    </w:p>
+    <w:p>
+      <w:pPr>
+        <w:spacing w:after="120"/>
+      </w:pPr>
+      <w:r>
+        <w:t>Fourth, it offers an evaluation design that other work on this task can reuse. Rather than resting on similarity to a single reference reply, it combines three things: explicit checks on what a supportive reply must do, an empathy panel that places two model judges from different developers alongside a classifier trained directly on human ratings, and paired statistical testing with correction for multiple comparisons, so that a difference is reported as real only when both the adjusted test and the confidence interval agree.</w:t>
+      </w:r>
+    </w:p>
+    <w:p>
+      <w:pPr>
+        <w:spacing w:after="120"/>
+      </w:pPr>
+      <w:r>
+        <w:t>Fifth, it delivers a working multi-turn conversational agent rather than a benchmark entry, with a measured context window for the detector, a separate memory for the generator, and rules that relax after the first turn so that the exchange does not become an interrogation.</w:t>
+      </w:r>
+    </w:p>
+    <w:p>
+      <w:pPr>
+        <w:spacing w:after="120"/>
+      </w:pPr>
+      <w:r>
+        <w:t>Sixth, it documents the practical failures that a reproduction would otherwise repeat, including a fine-tuning defect in which using the wrong padding token prevents the model from learning to stop, and an attention implementation that silently returns no weights at all.</w:t>
+      </w:r>
+    </w:p>
+    <w:p>
+      <w:pPr>
+        <w:pStyle w:val="Heading1"/>
+      </w:pPr>
+      <w:r>
+        <w:t>6.3 Limitations</w:t>
+      </w:r>
+    </w:p>
+    <w:p>
+      <w:pPr>
+        <w:spacing w:after="120"/>
+      </w:pPr>
+      <w:r>
+        <w:t>Seven limitations bound these conclusions, set out in full in Section 5.6.5. The corpus is English, crowd-sourced and carries one label per conversation, so nothing here should be assumed to hold for Bangla speakers or for people in genuine distress. The label set contains no category for suicidal ideation and the system has no crisis safeguard. Every automatic measure is a proxy: the acknowledgement check looks for keywords, the empathy classifier was trained in a different domain and rewards length, and emotional fidelity is scored by our own detector. The evidence rests on 300 conversations, 64 of them seen by the judges, and a small human study. The quantitative results all concern first replies, the multi-turn agent having been checked on scenarios rather than measured. Repetition remains high at 58.7% of replies. And the cost figures come from one graphics card over 50 messages.</w:t>
+      </w:r>
+    </w:p>
+    <w:p>
+      <w:pPr>
+        <w:pStyle w:val="Heading1"/>
+      </w:pPr>
+      <w:r>
+        <w:t>6.4 Recommendations for Future Work</w:t>
       </w:r>
     </w:p>
     <w:p>
@@ -74,10 +174,10 @@
         <w:rPr>
           <w:b/>
         </w:rPr>
-        <w:t>Close the rule-adherence gap:</w:t>
+        <w:t>Immediate extensions:</w:t>
       </w:r>
       <w:r>
-        <w:t xml:space="preserve"> the decoupled system follows its own response rules less often than a single model because the rules share the prompt with emotion-specific guidance. Separating rule enforcement from generation, by checking and repairing the reply after it is written, should recover the gap without giving up the emotional guidance.</w:t>
+        <w:t xml:space="preserve"> A crisis filter that inspects the message before generation and answers from reviewed safe responses is required before this system is put in front of anyone, and it is the first piece of work we recommend [52]. Next is a component-wise ablation separating the three things the pipeline supplies at once, the emotion choice, the per-emotion guidance and the attention cues, so that the contribution of each is known rather than inferred. The rule-adherence gap should be closed by checking and repairing the reply after it is written instead of asking the prompt to carry both the rules and the guidance, and repetition should be controlled at decoding time; both were deliberately deferred here so that the evaluated outputs stayed fixed.</w:t>
       </w:r>
     </w:p>
     <w:p>
@@ -88,10 +188,10 @@
         <w:rPr>
           <w:b/>
         </w:rPr>
-        <w:t>Reduce repetition:</w:t>
+        <w:t>Beyond English:</w:t>
       </w:r>
       <w:r>
-        <w:t xml:space="preserve"> the system reuses stock supportive phrases in 58.7% of replies. This is better than the single-model baselines but still high, and a repetition penalty or a decoding constraint is the obvious next step; it was deliberately deferred in this project so that the evaluated outputs would remain fixed.</w:t>
+        <w:t xml:space="preserve"> The decoupled structure is an advantage here, because a new language needs a new detector and new guidance but not a new generator, and the detector is only 125 million parameters. Three steps follow: collect or adapt labelled emotional conversations in Bangla, including the code-mixed Bangla-English that people here actually type; retrain the detector from a multilingual encoder; and rewrite the per-emotion guidance with speakers of the language, since how loneliness or shame should be answered is not the same everywhere and a translated prompt would carry English assumptions into it. Published work on low-resource emotion classification suggests the detector is where the difficulty will concentrate [20].</w:t>
       </w:r>
     </w:p>
     <w:p>
@@ -102,10 +202,10 @@
         <w:rPr>
           <w:b/>
         </w:rPr>
-        <w:t>Evaluate multi-turn behaviour:</w:t>
+        <w:t>Stronger evaluation:</w:t>
       </w:r>
       <w:r>
-        <w:t xml:space="preserve"> all reported measurements are single-turn. The multi-turn agent works, but nothing here measures whether the emotional tracking across turns helps a real conversation.</w:t>
+        <w:t xml:space="preserve"> The measurements should extend from single replies to whole conversations judged by people rather than by scenarios, and the human study should be repeated at a size that supports statistical testing, preferably with mental-health professionals among the raters. The empathy panel would be stronger with more members, and the cost figures should be repeated on other hardware, including machines without a graphics card, since the case for this design is a case about deployment.</w:t>
       </w:r>
     </w:p>
     <w:p>
@@ -116,10 +216,10 @@
         <w:rPr>
           <w:b/>
         </w:rPr>
-        <w:t>Test the design in Bangla and with real users:</w:t>
+        <w:t>Final remarks:</w:t>
       </w:r>
       <w:r>
-        <w:t xml:space="preserve"> the dataset, the models and the evaluation are entirely in English, and the evaluation uses crowd-sourced situations rather than people seeking support. Both would have to change before any claim about usefulness in Bangladesh could be made, and a crisis safeguard would have to be added first.</w:t>
+        <w:t xml:space="preserve"> The value of this work does not lie in a new record on a benchmark, and it was not built to obtain one. It lies in showing, by measurement rather than argument, that a system assembled from a small specialised model and a modest general one can be more emotionally responsive than a single model of the same size, can run on hardware a student already owns so that a person's disclosure never leaves their machine, and can show exactly what it understood before it answers. As capable open models continue to become smaller, how to arrange them will matter more than how large to make them, and a design whose emotional reasoning can be inspected, corrected and replaced one part at a time is what a sensitive application will require.</w:t>
       </w:r>
     </w:p>
     <w:sectPr>

</xml_diff>